<commit_message>
Audit project claims and documentation
</commit_message>
<xml_diff>
--- a/week4/project-documentation/AfterPO_Week4_Project_Documentation_for_Google_Docs.docx
+++ b/week4/project-documentation/AfterPO_Week4_Project_Documentation_for_Google_Docs.docx
@@ -42,7 +42,7 @@
           <w:color w:val="5D6673"/>
           <w:sz w:val="22"/>
         </w:rPr>
-        <w:t>Week 4 submission • LangSmith experiments • reproducible evidence</w:t>
+        <w:t>Week 4 Evaluation with LangSmith Experiments and Reproducible Evidence</w:t>
       </w:r>
     </w:p>
     <w:tbl>
@@ -1137,7 +1137,7 @@
     </w:p>
     <w:p>
       <w:r>
-        <w:t>AfterPO Supplier Blame Benchmark v1 contains 40 human-authored, manually labelled synthetic cases. It includes supplier fault, shared responsibility, internal causes, inconclusive evidence, five counterfactual pairs and two adversarial records.</w:t>
+        <w:t>AfterPO Supplier Blame Benchmark v1 contains 40 manually curated and labelled synthetic cases. It includes supplier fault, shared responsibility, internal causes, inconclusive evidence, five counterfactual pairs and two adversarial records.</w:t>
       </w:r>
     </w:p>
     <w:tbl>
@@ -4128,7 +4128,7 @@
         <w:rPr>
           <w:color w:val="000000"/>
         </w:rPr>
-        <w:t>10. Submission evidence map</w:t>
+        <w:t>10 Evidence and Reproducibility</w:t>
       </w:r>
     </w:p>
     <w:tbl>
@@ -4159,7 +4159,13 @@
             <w:shd w:fill="17243A"/>
           </w:tcPr>
           <w:p>
-            <w:r/>
+            <w:r>
+              <w:rPr>
+                <w:b/>
+                <w:color w:val="FFFFFF"/>
+              </w:rPr>
+              <w:t>Evidence source</w:t>
+            </w:r>
             <w:r>
               <w:rPr>
                 <w:rFonts w:ascii="Aptos" w:hAnsi="Aptos"/>
@@ -4167,7 +4173,6 @@
                 <w:color w:val="FFFFFF"/>
                 <w:sz w:val="16"/>
               </w:rPr>
-              <w:t>Requested artifact</w:t>
             </w:r>
           </w:p>
         </w:tc>
@@ -4184,7 +4189,13 @@
             <w:shd w:fill="17243A"/>
           </w:tcPr>
           <w:p>
-            <w:r/>
+            <w:r>
+              <w:rPr>
+                <w:b/>
+                <w:color w:val="FFFFFF"/>
+              </w:rPr>
+              <w:t>What it contains</w:t>
+            </w:r>
             <w:r>
               <w:rPr>
                 <w:rFonts w:ascii="Aptos" w:hAnsi="Aptos"/>
@@ -4192,7 +4203,6 @@
                 <w:color w:val="FFFFFF"/>
                 <w:sz w:val="16"/>
               </w:rPr>
-              <w:t>Included evidence</w:t>
             </w:r>
           </w:p>
         </w:tc>
@@ -4214,14 +4224,15 @@
             <w:shd w:fill="FFFFFF"/>
           </w:tcPr>
           <w:p>
-            <w:r/>
+            <w:r>
+              <w:t>Evaluation workbook</w:t>
+            </w:r>
             <w:r>
               <w:rPr>
                 <w:rFonts w:ascii="Aptos" w:hAnsi="Aptos"/>
                 <w:b w:val="0"/>
                 <w:sz w:val="16"/>
               </w:rPr>
-              <w:t>Spreadsheet</w:t>
             </w:r>
           </w:p>
         </w:tc>
@@ -4238,14 +4249,15 @@
             <w:shd w:fill="FFFFFF"/>
           </w:tcPr>
           <w:p>
-            <w:r/>
+            <w:r>
+              <w:t>AfterPO_Week4_Evaluation.xlsx contains aggregate metrics, the 40-case register, experiment registry, trace evidence and contribution analysis.</w:t>
+            </w:r>
             <w:r>
               <w:rPr>
                 <w:rFonts w:ascii="Aptos" w:hAnsi="Aptos"/>
                 <w:b w:val="0"/>
                 <w:sz w:val="16"/>
               </w:rPr>
-              <w:t>AfterPO_Week4_Evaluation.xlsx: metrics, 40 cases, experiment registry, trace evidence and contribution table.</w:t>
             </w:r>
           </w:p>
         </w:tc>
@@ -4267,14 +4279,15 @@
             <w:shd w:fill="F6F8FA"/>
           </w:tcPr>
           <w:p>
-            <w:r/>
+            <w:r>
+              <w:t>Evaluation report</w:t>
+            </w:r>
             <w:r>
               <w:rPr>
                 <w:rFonts w:ascii="Aptos" w:hAnsi="Aptos"/>
                 <w:b w:val="0"/>
                 <w:sz w:val="16"/>
               </w:rPr>
-              <w:t>Solution document</w:t>
             </w:r>
           </w:p>
         </w:tc>
@@ -4291,14 +4304,15 @@
             <w:shd w:fill="F6F8FA"/>
           </w:tcPr>
           <w:p>
-            <w:r/>
+            <w:r>
+              <w:t>This document records the architecture, dataset, prompts, iterations, measured results, failures, evidence links and learnings.</w:t>
+            </w:r>
             <w:r>
               <w:rPr>
                 <w:rFonts w:ascii="Aptos" w:hAnsi="Aptos"/>
                 <w:b w:val="0"/>
                 <w:sz w:val="16"/>
               </w:rPr>
-              <w:t>This document: architecture, dataset, prompts, iterations, results, failures, links and learnings.</w:t>
             </w:r>
           </w:p>
         </w:tc>
@@ -4320,14 +4334,15 @@
             <w:shd w:fill="FFFFFF"/>
           </w:tcPr>
           <w:p>
-            <w:r/>
+            <w:r>
+              <w:t>LangSmith evidence</w:t>
+            </w:r>
             <w:r>
               <w:rPr>
                 <w:rFonts w:ascii="Aptos" w:hAnsi="Aptos"/>
                 <w:b w:val="0"/>
                 <w:sz w:val="16"/>
               </w:rPr>
-              <w:t>LangSmith project/run evidence</w:t>
             </w:r>
           </w:p>
         </w:tc>
@@ -4344,14 +4359,15 @@
             <w:shd w:fill="FFFFFF"/>
           </w:tcPr>
           <w:p>
-            <w:r/>
+            <w:r>
+              <w:t>Registered experiment and ticket-level trace links are listed in Sections 4 and 6.</w:t>
+            </w:r>
             <w:r>
               <w:rPr>
                 <w:rFonts w:ascii="Aptos" w:hAnsi="Aptos"/>
                 <w:b w:val="0"/>
                 <w:sz w:val="16"/>
               </w:rPr>
-              <w:t>Registered experiment and ticket-level trace links in Sections 4 and 6.</w:t>
             </w:r>
           </w:p>
         </w:tc>
@@ -4373,14 +4389,15 @@
             <w:shd w:fill="F6F8FA"/>
           </w:tcPr>
           <w:p>
-            <w:r/>
+            <w:r>
+              <w:t>Evaluation implementation</w:t>
+            </w:r>
             <w:r>
               <w:rPr>
                 <w:rFonts w:ascii="Aptos" w:hAnsi="Aptos"/>
                 <w:b w:val="0"/>
                 <w:sz w:val="16"/>
               </w:rPr>
-              <w:t>Executed notebook</w:t>
             </w:r>
           </w:p>
         </w:tc>
@@ -4397,14 +4414,15 @@
             <w:shd w:fill="F6F8FA"/>
           </w:tcPr>
           <w:p>
-            <w:r/>
+            <w:r>
+              <w:t>The evaluation runs through versioned Node.js scripts and registered LangSmith experiments. No notebook is part of this implementation.</w:t>
+            </w:r>
             <w:r>
               <w:rPr>
                 <w:rFonts w:ascii="Aptos" w:hAnsi="Aptos"/>
                 <w:b w:val="0"/>
                 <w:sz w:val="16"/>
               </w:rPr>
-              <w:t>Not applicable. The evaluation is implemented with Node.js scripts and registered LangSmith runs; no notebook was used.</w:t>
             </w:r>
           </w:p>
         </w:tc>
@@ -4426,14 +4444,15 @@
             <w:shd w:fill="FFFFFF"/>
           </w:tcPr>
           <w:p>
-            <w:r/>
+            <w:r>
+              <w:t>Evidence access</w:t>
+            </w:r>
             <w:r>
               <w:rPr>
                 <w:rFonts w:ascii="Aptos" w:hAnsi="Aptos"/>
                 <w:b w:val="0"/>
                 <w:sz w:val="16"/>
               </w:rPr>
-              <w:t>Screenshots</w:t>
             </w:r>
           </w:p>
         </w:tc>
@@ -4450,14 +4469,15 @@
             <w:shd w:fill="FFFFFF"/>
           </w:tcPr>
           <w:p>
-            <w:r/>
+            <w:r>
+              <w:t>Live LangSmith links provide inspectable evidence without embedding screenshots that may expose account details.</w:t>
+            </w:r>
             <w:r>
               <w:rPr>
                 <w:rFonts w:ascii="Aptos" w:hAnsi="Aptos"/>
                 <w:b w:val="0"/>
                 <w:sz w:val="16"/>
               </w:rPr>
-              <w:t>Not embedded to avoid exposing account details; live LangSmith links provide inspectable evidence.</w:t>
             </w:r>
           </w:p>
         </w:tc>

</xml_diff>